<commit_message>
Regenerate Word exports with updated repository links
Co-Authored-By: Claude Opus 4.8 <noreply@anthropic.com>
</commit_message>
<xml_diff>
--- a/paper/main.docx
+++ b/paper/main.docx
@@ -28,7 +28,7 @@
         </w:p>
       </w:sdtContent>
     </w:sdt>
-    <w:bookmarkStart w:id="61" w:name="X29e6e060ced4942090ab6ecbd749fce581bd562"/>
+    <w:bookmarkStart w:id="62" w:name="X29e6e060ced4942090ab6ecbd749fce581bd562"/>
     <w:p>
       <w:pPr>
         <w:pStyle w:val="Heading1"/>
@@ -15117,7 +15117,7 @@
       </w:r>
     </w:p>
     <w:bookmarkEnd w:id="58"/>
-    <w:bookmarkStart w:id="59" w:name="acknowledgment"/>
+    <w:bookmarkStart w:id="60" w:name="acknowledgment"/>
     <w:p>
       <w:pPr>
         <w:pStyle w:val="Heading2"/>
@@ -15221,11 +15221,25 @@
         <w:t xml:space="preserve"> </w:t>
       </w:r>
       <w:r>
-        <w:t xml:space="preserve">figure-generation code accompany this manuscript as supplementary material.</w:t>
+        <w:t xml:space="preserve">figure-generation code accompany this manuscript as supplementary material and are available at</w:t>
+      </w:r>
+      <w:r>
+        <w:t xml:space="preserve"> </w:t>
+      </w:r>
+      <w:hyperlink r:id="rId59">
+        <w:r>
+          <w:rPr>
+            <w:rStyle w:val="Hyperlink"/>
+          </w:rPr>
+          <w:t xml:space="preserve">https://github.com/mirryou-maker/qiskit-variance-reduced-unraveling</w:t>
+        </w:r>
+      </w:hyperlink>
+      <w:r>
+        <w:t xml:space="preserve">.</w:t>
       </w:r>
     </w:p>
-    <w:bookmarkEnd w:id="59"/>
-    <w:bookmarkStart w:id="60" w:name="references"/>
+    <w:bookmarkEnd w:id="60"/>
+    <w:bookmarkStart w:id="61" w:name="references"/>
     <w:p>
       <w:pPr>
         <w:pStyle w:val="Heading2"/>
@@ -17933,8 +17947,8 @@
         <w:t xml:space="preserve">.</w:t>
       </w:r>
     </w:p>
-    <w:bookmarkEnd w:id="60"/>
     <w:bookmarkEnd w:id="61"/>
+    <w:bookmarkEnd w:id="62"/>
     <w:sectPr>
       <w:footnotePr>
         <w:numRestart w:val="eachSect"/>

</xml_diff>

<commit_message>
Add Conflict of Interest statement
Declares no competing interests, explicitly covering the AI-tool vendor discussed in the
Acknowledgment and the organizations whose software/hardware is evaluated, plus funder
non-involvement. Applied to the journal source, the preprint, and the Word export.

Co-Authored-By: Claude Opus 4.8 <noreply@anthropic.com>
</commit_message>
<xml_diff>
--- a/paper/main.docx
+++ b/paper/main.docx
@@ -28,7 +28,7 @@
         </w:p>
       </w:sdtContent>
     </w:sdt>
-    <w:bookmarkStart w:id="62" w:name="X29e6e060ced4942090ab6ecbd749fce581bd562"/>
+    <w:bookmarkStart w:id="63" w:name="X29e6e060ced4942090ab6ecbd749fce581bd562"/>
     <w:p>
       <w:pPr>
         <w:pStyle w:val="Heading1"/>
@@ -15239,7 +15239,83 @@
       </w:r>
     </w:p>
     <w:bookmarkEnd w:id="60"/>
-    <w:bookmarkStart w:id="61" w:name="references"/>
+    <w:bookmarkStart w:id="61" w:name="conflict-of-interest"/>
+    <w:p>
+      <w:pPr>
+        <w:pStyle w:val="Heading2"/>
+      </w:pPr>
+      <w:r>
+        <w:t xml:space="preserve">Conflict of Interest</w:t>
+      </w:r>
+    </w:p>
+    <w:p>
+      <w:pPr>
+        <w:pStyle w:val="FirstParagraph"/>
+      </w:pPr>
+      <w:r>
+        <w:t xml:space="preserve">The author declares no competing financial or non-financial interests.</w:t>
+      </w:r>
+    </w:p>
+    <w:p>
+      <w:pPr>
+        <w:pStyle w:val="BodyText"/>
+      </w:pPr>
+      <w:r>
+        <w:t xml:space="preserve">In particular, the author has no financial or personal relationship with, and receives no support,</w:t>
+      </w:r>
+      <w:r>
+        <w:t xml:space="preserve"> </w:t>
+      </w:r>
+      <w:r>
+        <w:t xml:space="preserve">funding, or benefit of any kind from, Anthropic or any other vendor of the AI coding assistant</w:t>
+      </w:r>
+      <w:r>
+        <w:t xml:space="preserve"> </w:t>
+      </w:r>
+      <w:r>
+        <w:t xml:space="preserve">disclosed in the Acknowledgment; no such vendor had any role in the design, execution, analysis, or</w:t>
+      </w:r>
+      <w:r>
+        <w:t xml:space="preserve"> </w:t>
+      </w:r>
+      <w:r>
+        <w:t xml:space="preserve">reporting of this work, and none reviewed the manuscript prior to submission. Likewise, the author has</w:t>
+      </w:r>
+      <w:r>
+        <w:t xml:space="preserve"> </w:t>
+      </w:r>
+      <w:r>
+        <w:t xml:space="preserve">no affiliation with, or financial interest in, IBM, the Qiskit project, NVIDIA, or any other</w:t>
+      </w:r>
+      <w:r>
+        <w:t xml:space="preserve"> </w:t>
+      </w:r>
+      <w:r>
+        <w:t xml:space="preserve">organization whose software or hardware is evaluated here.</w:t>
+      </w:r>
+    </w:p>
+    <w:p>
+      <w:pPr>
+        <w:pStyle w:val="BodyText"/>
+      </w:pPr>
+      <w:r>
+        <w:t xml:space="preserve">The funding bodies named in the Acknowledgment had no role in the design of the study; in the</w:t>
+      </w:r>
+      <w:r>
+        <w:t xml:space="preserve"> </w:t>
+      </w:r>
+      <w:r>
+        <w:t xml:space="preserve">collection, analysis, or interpretation of the data; in the writing of the manuscript; or in the</w:t>
+      </w:r>
+      <w:r>
+        <w:t xml:space="preserve"> </w:t>
+      </w:r>
+      <w:r>
+        <w:t xml:space="preserve">decision to submit it for publication.</w:t>
+      </w:r>
+    </w:p>
+    <w:bookmarkEnd w:id="61"/>
+    <w:bookmarkStart w:id="62" w:name="references"/>
     <w:p>
       <w:pPr>
         <w:pStyle w:val="Heading2"/>
@@ -17947,8 +18023,8 @@
         <w:t xml:space="preserve">.</w:t>
       </w:r>
     </w:p>
-    <w:bookmarkEnd w:id="61"/>
     <w:bookmarkEnd w:id="62"/>
+    <w:bookmarkEnd w:id="63"/>
     <w:sectPr>
       <w:footnotePr>
         <w:numRestart w:val="eachSect"/>

</xml_diff>

<commit_message>
Shorten the Conflict of Interest statement to a single declaration
Co-Authored-By: Claude Opus 4.8 <noreply@anthropic.com>
</commit_message>
<xml_diff>
--- a/paper/main.docx
+++ b/paper/main.docx
@@ -15254,64 +15254,6 @@
       </w:pPr>
       <w:r>
         <w:t xml:space="preserve">The author declares no competing financial or non-financial interests.</w:t>
-      </w:r>
-    </w:p>
-    <w:p>
-      <w:pPr>
-        <w:pStyle w:val="BodyText"/>
-      </w:pPr>
-      <w:r>
-        <w:t xml:space="preserve">In particular, the author has no financial or personal relationship with, and receives no support,</w:t>
-      </w:r>
-      <w:r>
-        <w:t xml:space="preserve"> </w:t>
-      </w:r>
-      <w:r>
-        <w:t xml:space="preserve">funding, or benefit of any kind from, Anthropic or any other vendor of the AI coding assistant</w:t>
-      </w:r>
-      <w:r>
-        <w:t xml:space="preserve"> </w:t>
-      </w:r>
-      <w:r>
-        <w:t xml:space="preserve">disclosed in the Acknowledgment; no such vendor had any role in the design, execution, analysis, or</w:t>
-      </w:r>
-      <w:r>
-        <w:t xml:space="preserve"> </w:t>
-      </w:r>
-      <w:r>
-        <w:t xml:space="preserve">reporting of this work, and none reviewed the manuscript prior to submission. Likewise, the author has</w:t>
-      </w:r>
-      <w:r>
-        <w:t xml:space="preserve"> </w:t>
-      </w:r>
-      <w:r>
-        <w:t xml:space="preserve">no affiliation with, or financial interest in, IBM, the Qiskit project, NVIDIA, or any other</w:t>
-      </w:r>
-      <w:r>
-        <w:t xml:space="preserve"> </w:t>
-      </w:r>
-      <w:r>
-        <w:t xml:space="preserve">organization whose software or hardware is evaluated here.</w:t>
-      </w:r>
-    </w:p>
-    <w:p>
-      <w:pPr>
-        <w:pStyle w:val="BodyText"/>
-      </w:pPr>
-      <w:r>
-        <w:t xml:space="preserve">The funding bodies named in the Acknowledgment had no role in the design of the study; in the</w:t>
-      </w:r>
-      <w:r>
-        <w:t xml:space="preserve"> </w:t>
-      </w:r>
-      <w:r>
-        <w:t xml:space="preserve">collection, analysis, or interpretation of the data; in the writing of the manuscript; or in the</w:t>
-      </w:r>
-      <w:r>
-        <w:t xml:space="preserve"> </w:t>
-      </w:r>
-      <w:r>
-        <w:t xml:space="preserve">decision to submit it for publication.</w:t>
       </w:r>
     </w:p>
     <w:bookmarkEnd w:id="61"/>

</xml_diff>